<commit_message>
Update master-rad-sazetak document formats to improve accessibility and usability
</commit_message>
<xml_diff>
--- a/docs/01-project/master-rad-sazetak.docx
+++ b/docs/01-project/master-rad-sazetak.docx
@@ -35,7 +35,7 @@
         <w:rPr>
           <w:sz w:val="36"/>
         </w:rPr>
-        <w:t>IzdajIznajmiV2</w:t>
+        <w:t>IzdajIznajmi</w:t>
       </w:r>
     </w:p>
     <w:p>
@@ -88,7 +88,21 @@
       </w:r>
       <w:r>
         <w:rPr/>
-        <w:t xml:space="preserve"> ______________________________</w:t>
+        <w:t xml:space="preserve"> </w:t>
+      </w:r>
+      <w:r>
+        <w:rPr/>
+        <w:t xml:space="preserve">Marko </w:t>
+      </w:r>
+      <w:r>
+        <w:rPr>
+          <w:rStyle w:val="Emphasis"/>
+        </w:rPr>
+        <w:t>Đ</w:t>
+      </w:r>
+      <w:r>
+        <w:rPr/>
+        <w:t>okić</w:t>
       </w:r>
     </w:p>
     <w:p>
@@ -137,7 +151,23 @@
       </w:pPr>
       <w:r>
         <w:rPr/>
-        <w:t xml:space="preserve">IzdajIznajmiV2 je integrisana web platforma namenjena kratkoročnom, srednjoročnom i dugoročnom izdavanju i iznajmljivanju smeštaja na tržištu Srbije. Svrha projekta je da na jednom mestu objedini objavljivanje oglasa, pronalaženje odgovarajućeg smeštaja i upravljanje procesom najma. Projekat rešava problem rasutih informacija, otežanog poređenja ponuda i nepovezane komunikacije između tražilaca smeštaja i izdavalaca. Sistem razlikuje četiri osnovne uloge: gosta, tražioca smeštaja, izdavaoca i administratora. Gost može da pregleda javno dostupne oglase, dok se registrovani tražilac nakon verifikacije naloga prijavljuje za smeštaj, zakazuje obilazak i prati dalji tok prijave. Izdavalac kreira i uređuje oglase, upravlja pristiglim prijavama i zahtevima za obilazak i komunicira sa zainteresovanim korisnicima. Administrator nadgleda rad sistema i pristupa funkcijama za upravljanje korisnicima, verifikaciju i moderaciju. Posebno važan deo aplikacije čine ugrađeni razgovori i obaveštenja, koji omogućavaju da komunikacija i informacije o promenama statusa ostanu unutar jedinstvenog sistema. Pretraga i filtriranje oglasa pomažu korisniku da efikasnije pronađe ponudu koja odgovara njegovim zahtevima. Korisnički interfejs razvijen je kao Vue 3 aplikacija uz TypeScript, Vite, Pinia i Vue Router, a sa serverskim delom komunicira preko verzionisanog REST API-ja. Serverski deo zasnovan je na Laravelu 12, koristi Sanctum za autentifikaciju i autorizaciju, a trajne podatke čuva u PostgreSQL bazi. Meilisearch podržava naprednu pretragu, Reverb komunikaciju u realnom vremenu, dok Leaflet i OpenStreetMap omogućavaju funkcionalnosti zasnovane na lokaciji. Povezivanje frontend, backend i tehnologija baze podataka sa navedenim servisima pokazuje izradu višeslojne aplikacije i praktičnu integraciju heterogenih tehnologija u jedinstven informacioni sistem. Docker Compose orkestrira aplikacione i infrastrukturne kontejnere na lokalnoj mašini, dok Cloudflare Tunnel omogućava bezbedno izlaganje produkciono nalik demonstracionog okruženja na javnom domenu </w:t>
+        <w:t>IzdajIznajmiV2 je integrisana web platforma namenjena kratkoročnom, srednjoročnom i dugoročnom izdavanju i iznajmljivanju smeštaja na tržištu Srbije. Svrha projekta je da na jednom mestu objedini objavljivanje oglasa, pronalaženje odgovarajućeg smeštaja i upravljanje procesom najma. Projekat rešava problem rasutih informacija, otežanog poređenja ponuda i nepovezane komunikacije između tražilaca smeštaja i izdavalaca. Sistem razlikuje četiri osnovne uloge: gosta, tražioca smeštaja, izdavaoca i administratora. Gost može da pregleda javno dostupne oglase, dok se registrovani tražilac nakon verifikacije naloga prijavljuje za smeštaj, zakazuje obilazak i prati dalji tok prijave. Izdavalac kreira i uređuje oglase, upravlja pristiglim prijavama i zahtevima za obilazak i komunicira sa zainteresovanim korisnicima. Administrator nadgleda rad sistema i pristupa funkcijama za upravljanje korisnicima, verifikaciju i moderaciju. Posebno važan deo aplikacije čine ugrađeni razgovori i obaveštenja, koji omogućavaju da komunikacija i informacije o promenama statusa ostanu unutar jedinstvenog sistema. Pretraga i filtriranje oglasa pomažu korisniku da efikasnije pronađe ponudu koja odgovara njegovim zahtevima. Korisnički interfejs razvijen je kao Vue 3 aplikacija uz TypeScript, Vite, Pinia i Vue Router, a sa serverskim delom komunicira preko verzionisanog REST API-ja. Serverski deo zasnovan je na Laravelu 12, koristi Sanctum za autentifikaciju i autorizaciju, a trajne podatke čuva u PostgreSQL bazi. Meilisearch podržava naprednu pretragu, Reverb komunikaciju u realnom vremenu, dok Leaflet i OpenStreetMap omogućavaju funkcionalnosti zasnovane na lokaciji. Povezivanje frontend, backend i tehnologija baze podataka sa navedenim servisima pokazuje izradu višeslojne aplikacije i praktičnu integraciju heterogenih tehnologija u jedinstven informacioni sistem. Docker Compose orkestrira aplikacione i infrastrukturne kontejnere na lokalnoj mašini, dok Cloudflare Tunnel omogućava bezbedno izlaganje produkci</w:t>
+      </w:r>
+      <w:r>
+        <w:rPr/>
+        <w:t>ji,</w:t>
+      </w:r>
+      <w:r>
+        <w:rPr/>
+        <w:t xml:space="preserve"> nalik demonstracio</w:t>
+      </w:r>
+      <w:r>
+        <w:rPr/>
+        <w:t>nom</w:t>
+      </w:r>
+      <w:r>
+        <w:rPr/>
+        <w:t xml:space="preserve"> okruženja na javnom domenu </w:t>
       </w:r>
       <w:hyperlink r:id="rId2">
         <w:r>
@@ -159,6 +189,7 @@
       <w:pgNumType w:fmt="decimal"/>
       <w:formProt w:val="false"/>
       <w:textDirection w:val="lrTb"/>
+      <w:docGrid w:type="default" w:linePitch="100" w:charSpace="0"/>
     </w:sectPr>
   </w:body>
 </w:document>
@@ -186,12 +217,15 @@
     <w:qFormat/>
     <w:pPr>
       <w:widowControl w:val="false"/>
+      <w:suppressAutoHyphens w:val="true"/>
       <w:bidi w:val="0"/>
-      <w:spacing w:lineRule="auto" w:line="372"/>
+      <w:spacing w:lineRule="auto" w:line="372" w:before="0" w:after="0"/>
+      <w:jc w:val="start"/>
     </w:pPr>
     <w:rPr>
       <w:rFonts w:ascii="DejaVu Serif;Liberation Serif;serif" w:hAnsi="DejaVu Serif;Liberation Serif;serif" w:eastAsia="DejaVu Serif;Liberation Serif;serif" w:cs="DejaVu Serif;Liberation Serif;serif"/>
       <w:color w:val="111827"/>
+      <w:kern w:val="0"/>
       <w:sz w:val="24"/>
       <w:szCs w:val="24"/>
       <w:lang w:val="en-US" w:eastAsia="zh-CN" w:bidi="hi-IN"/>
@@ -257,6 +291,14 @@
       <w:color w:val="111827"/>
       <w:u w:val="none"/>
       <w:effect w:val="none"/>
+    </w:rPr>
+  </w:style>
+  <w:style w:type="character" w:styleId="Emphasis">
+    <w:name w:val="Emphasis"/>
+    <w:qFormat/>
+    <w:rPr>
+      <w:i/>
+      <w:iCs/>
     </w:rPr>
   </w:style>
   <w:style w:type="paragraph" w:styleId="Heading">

</xml_diff>